<commit_message>
mail szerver dokumentáció készen
</commit_message>
<xml_diff>
--- a/mail_szerver.docx
+++ b/mail_szerver.docx
@@ -4,1230 +4,727 @@
   <w:body>
     <w:p>
       <w:r>
-        <w:t>1. Projekt célja</w:t>
-      </w:r>
-    </w:p>
-    <w:p>
-      <w:r>
-        <w:t xml:space="preserve">A projekt célja egy modern, biztonságos és könnyen kezelhető levelezőszerver létrehozása </w:t>
-      </w:r>
-      <w:proofErr w:type="spellStart"/>
+        <w:t>A célunk</w:t>
+      </w:r>
+      <w:r>
+        <w:t xml:space="preserve"> egy teljes értékű, modern és biztonságos levelezőszerver létrehozása volt </w:t>
+      </w:r>
       <w:r>
         <w:rPr>
           <w:b/>
           <w:bCs/>
+          <w:color w:val="C00000"/>
+          <w:u w:val="single"/>
         </w:rPr>
-        <w:t>Mailcow</w:t>
-      </w:r>
-      <w:proofErr w:type="spellEnd"/>
+        <w:t>Mailcow Dockerized</w:t>
+      </w:r>
+      <w:r>
+        <w:rPr>
+          <w:color w:val="C00000"/>
+        </w:rPr>
+        <w:t xml:space="preserve"> </w:t>
+      </w:r>
+      <w:r>
+        <w:t xml:space="preserve">alapokon. A rendszer egy </w:t>
+      </w:r>
+      <w:r>
+        <w:rPr>
+          <w:u w:val="single"/>
+        </w:rPr>
+        <w:t>VirtualBoxban</w:t>
+      </w:r>
+      <w:r>
+        <w:t xml:space="preserve"> futó Linux szerveren működik, amely stabil környezetet biztosít a konténerizált szolgáltatások számára</w:t>
+      </w:r>
+      <w:r>
+        <w:t>.</w:t>
+      </w:r>
+    </w:p>
+    <w:p>
+      <w:r>
+        <w:t xml:space="preserve">A munkát a </w:t>
+      </w:r>
+      <w:r>
+        <w:rPr>
+          <w:u w:val="single"/>
+        </w:rPr>
+        <w:t>VirtualBoxban</w:t>
+      </w:r>
+      <w:r>
+        <w:t xml:space="preserve"> létrehozott Linux szerver indításával kezdtük. A rendszer betöltése után első lépésként ellenőriztük a hálózati kapcsolatot és a szerver IP</w:t>
+      </w:r>
+      <w:r>
+        <w:noBreakHyphen/>
+        <w:t xml:space="preserve">címét, amelyre a későbbi konfigurációk során szükség volt. Ehhez az </w:t>
+      </w:r>
       <w:r>
         <w:rPr>
           <w:b/>
           <w:bCs/>
+          <w:i/>
+          <w:iCs/>
+          <w:highlight w:val="green"/>
         </w:rPr>
-        <w:t xml:space="preserve"> </w:t>
-      </w:r>
-      <w:proofErr w:type="spellStart"/>
+        <w:t>ip a</w:t>
+      </w:r>
+      <w:r>
+        <w:t xml:space="preserve"> parancsot használtuk, amely megjeleníti a hálózati interfészeket és az aktuális IP</w:t>
+      </w:r>
+      <w:r>
+        <w:noBreakHyphen/>
+        <w:t>címeket.</w:t>
+      </w:r>
+    </w:p>
+    <w:p>
+      <w:pPr>
+        <w:jc w:val="center"/>
+      </w:pPr>
+      <w:r>
+        <w:drawing>
+          <wp:inline distT="0" distB="0" distL="0" distR="0" wp14:anchorId="0CFE5540" wp14:editId="1DE384C5">
+            <wp:extent cx="5760720" cy="2296795"/>
+            <wp:effectExtent l="0" t="0" r="0" b="8255"/>
+            <wp:docPr id="1123389334" name="Kép 1" descr="A képen szöveg, képernyőkép, Betűtípus, szoftver látható&#10;&#10;Előfordulhat, hogy az AI által létrehozott tartalom helytelen."/>
+            <wp:cNvGraphicFramePr>
+              <a:graphicFrameLocks xmlns:a="http://schemas.openxmlformats.org/drawingml/2006/main" noChangeAspect="1"/>
+            </wp:cNvGraphicFramePr>
+            <a:graphic xmlns:a="http://schemas.openxmlformats.org/drawingml/2006/main">
+              <a:graphicData uri="http://schemas.openxmlformats.org/drawingml/2006/picture">
+                <pic:pic xmlns:pic="http://schemas.openxmlformats.org/drawingml/2006/picture">
+                  <pic:nvPicPr>
+                    <pic:cNvPr id="1123389334" name="Kép 1" descr="A képen szöveg, képernyőkép, Betűtípus, szoftver látható&#10;&#10;Előfordulhat, hogy az AI által létrehozott tartalom helytelen."/>
+                    <pic:cNvPicPr/>
+                  </pic:nvPicPr>
+                  <pic:blipFill>
+                    <a:blip r:embed="rId5"/>
+                    <a:stretch>
+                      <a:fillRect/>
+                    </a:stretch>
+                  </pic:blipFill>
+                  <pic:spPr>
+                    <a:xfrm>
+                      <a:off x="0" y="0"/>
+                      <a:ext cx="5760720" cy="2296795"/>
+                    </a:xfrm>
+                    <a:prstGeom prst="rect">
+                      <a:avLst/>
+                    </a:prstGeom>
+                  </pic:spPr>
+                </pic:pic>
+              </a:graphicData>
+            </a:graphic>
+          </wp:inline>
+        </w:drawing>
+      </w:r>
+    </w:p>
+    <w:p>
+      <w:r>
+        <w:t xml:space="preserve">Miután meggyőződtünk arról, hogy a hálózat megfelelően működik, frissítettük a rendszert az </w:t>
+      </w:r>
       <w:r>
         <w:rPr>
           <w:b/>
           <w:bCs/>
+          <w:i/>
+          <w:iCs/>
+          <w:highlight w:val="green"/>
         </w:rPr>
-        <w:t>Dockerized</w:t>
-      </w:r>
-      <w:proofErr w:type="spellEnd"/>
-      <w:r>
-        <w:t xml:space="preserve"> rendszerrel.</w:t>
-      </w:r>
-      <w:r>
-        <w:br/>
-        <w:t xml:space="preserve">A szerver egy </w:t>
-      </w:r>
-      <w:proofErr w:type="spellStart"/>
-      <w:r>
-        <w:t>VirtualBoxban</w:t>
-      </w:r>
-      <w:proofErr w:type="spellEnd"/>
-      <w:r>
-        <w:t xml:space="preserve"> futó Linux gépen működik, és teljes értékű email szolgáltatást biztosít a</w:t>
-      </w:r>
-      <w:r>
-        <w:t>z</w:t>
-      </w:r>
-      <w:r>
-        <w:t xml:space="preserve"> </w:t>
-      </w:r>
-      <w:proofErr w:type="spellStart"/>
-      <w:r>
-        <w:t>office.lan</w:t>
-      </w:r>
-      <w:proofErr w:type="spellEnd"/>
-      <w:r>
-        <w:t xml:space="preserve"> belső </w:t>
-      </w:r>
-      <w:proofErr w:type="spellStart"/>
-      <w:r>
-        <w:t>domain</w:t>
-      </w:r>
-      <w:proofErr w:type="spellEnd"/>
-      <w:r>
-        <w:t xml:space="preserve"> számára.</w:t>
-      </w:r>
-    </w:p>
-    <w:p>
-      <w:r>
-        <w:t>2. Rendszerkövetelmények</w:t>
-      </w:r>
-    </w:p>
-    <w:p>
-      <w:proofErr w:type="spellStart"/>
-      <w:r>
-        <w:t>VirtualBox</w:t>
-      </w:r>
-      <w:proofErr w:type="spellEnd"/>
-      <w:r>
-        <w:t xml:space="preserve"> VM</w:t>
-      </w:r>
-    </w:p>
-    <w:p>
-      <w:pPr>
-        <w:numPr>
-          <w:ilvl w:val="0"/>
-          <w:numId w:val="2"/>
-        </w:numPr>
-      </w:pPr>
-      <w:r>
-        <w:t>OS: Debian 12 / Ubuntu Server 22.04</w:t>
-      </w:r>
-    </w:p>
-    <w:p>
-      <w:pPr>
-        <w:numPr>
-          <w:ilvl w:val="0"/>
-          <w:numId w:val="2"/>
-        </w:numPr>
-      </w:pPr>
-      <w:r>
-        <w:t>CPU: 2 mag</w:t>
-      </w:r>
-    </w:p>
-    <w:p>
-      <w:pPr>
-        <w:numPr>
-          <w:ilvl w:val="0"/>
-          <w:numId w:val="2"/>
-        </w:numPr>
-      </w:pPr>
-      <w:r>
-        <w:t>RAM: 4–6 GB</w:t>
-      </w:r>
-    </w:p>
-    <w:p>
-      <w:pPr>
-        <w:numPr>
-          <w:ilvl w:val="0"/>
-          <w:numId w:val="2"/>
-        </w:numPr>
-      </w:pPr>
-      <w:r>
-        <w:t>Tárhely: 40 GB</w:t>
-      </w:r>
-    </w:p>
-    <w:p>
-      <w:pPr>
-        <w:numPr>
-          <w:ilvl w:val="0"/>
-          <w:numId w:val="2"/>
-        </w:numPr>
-      </w:pPr>
-      <w:r>
-        <w:t xml:space="preserve">Hálózat: NAT + Port </w:t>
-      </w:r>
-      <w:proofErr w:type="spellStart"/>
-      <w:r>
-        <w:t>Forwarding</w:t>
-      </w:r>
-      <w:proofErr w:type="spellEnd"/>
-      <w:r>
-        <w:t xml:space="preserve"> (8080 → 80, 8443 → 443)</w:t>
-      </w:r>
-    </w:p>
-    <w:p>
-      <w:r>
-        <w:t>Szoftverek</w:t>
-      </w:r>
-    </w:p>
-    <w:p>
-      <w:pPr>
-        <w:numPr>
-          <w:ilvl w:val="0"/>
-          <w:numId w:val="3"/>
-        </w:numPr>
-      </w:pPr>
-      <w:r>
-        <w:t xml:space="preserve">Docker </w:t>
-      </w:r>
-      <w:proofErr w:type="spellStart"/>
-      <w:r>
-        <w:t>Engine</w:t>
-      </w:r>
-      <w:proofErr w:type="spellEnd"/>
-    </w:p>
-    <w:p>
-      <w:pPr>
-        <w:numPr>
-          <w:ilvl w:val="0"/>
-          <w:numId w:val="3"/>
-        </w:numPr>
-      </w:pPr>
-      <w:r>
-        <w:t xml:space="preserve">Docker </w:t>
-      </w:r>
-      <w:proofErr w:type="spellStart"/>
-      <w:r>
-        <w:t>Compose</w:t>
-      </w:r>
-      <w:proofErr w:type="spellEnd"/>
-    </w:p>
-    <w:p>
-      <w:pPr>
-        <w:numPr>
-          <w:ilvl w:val="0"/>
-          <w:numId w:val="3"/>
-        </w:numPr>
-      </w:pPr>
-      <w:proofErr w:type="spellStart"/>
-      <w:r>
-        <w:t>Mailcow</w:t>
-      </w:r>
-      <w:proofErr w:type="spellEnd"/>
-      <w:r>
-        <w:t xml:space="preserve"> </w:t>
-      </w:r>
-      <w:proofErr w:type="spellStart"/>
-      <w:r>
-        <w:t>Dockerized</w:t>
-      </w:r>
-      <w:proofErr w:type="spellEnd"/>
-    </w:p>
-    <w:p>
-      <w:r>
-        <w:t>3. Telepítési lépések</w:t>
-      </w:r>
-    </w:p>
-    <w:p>
-      <w:r>
-        <w:t>3.1. Rendszer frissítése</w:t>
-      </w:r>
-    </w:p>
-    <w:p>
-      <w:proofErr w:type="spellStart"/>
-      <w:r>
-        <w:t>apt</w:t>
-      </w:r>
-      <w:proofErr w:type="spellEnd"/>
-      <w:r>
-        <w:t xml:space="preserve"> update &amp;&amp; </w:t>
-      </w:r>
-      <w:proofErr w:type="spellStart"/>
-      <w:r>
-        <w:t>apt</w:t>
-      </w:r>
-      <w:proofErr w:type="spellEnd"/>
-      <w:r>
-        <w:t xml:space="preserve"> upgrade -y </w:t>
-      </w:r>
-    </w:p>
-    <w:p>
-      <w:r>
-        <w:t>3.2. Docker telepítése</w:t>
-      </w:r>
-    </w:p>
-    <w:p>
-      <w:proofErr w:type="spellStart"/>
-      <w:r>
-        <w:t>apt</w:t>
-      </w:r>
-      <w:proofErr w:type="spellEnd"/>
-      <w:r>
-        <w:t xml:space="preserve"> </w:t>
-      </w:r>
-      <w:proofErr w:type="spellStart"/>
-      <w:r>
-        <w:t>install</w:t>
-      </w:r>
-      <w:proofErr w:type="spellEnd"/>
-      <w:r>
-        <w:t xml:space="preserve"> docker.io </w:t>
-      </w:r>
-      <w:proofErr w:type="spellStart"/>
-      <w:r>
-        <w:t>docker-compose</w:t>
-      </w:r>
-      <w:proofErr w:type="spellEnd"/>
-      <w:r>
-        <w:t xml:space="preserve"> -y </w:t>
-      </w:r>
-    </w:p>
-    <w:p>
-      <w:r>
-        <w:t xml:space="preserve">3.3. </w:t>
-      </w:r>
-      <w:proofErr w:type="spellStart"/>
-      <w:r>
-        <w:t>Mailcow</w:t>
-      </w:r>
-      <w:proofErr w:type="spellEnd"/>
-      <w:r>
-        <w:t xml:space="preserve"> letöltése</w:t>
-      </w:r>
-    </w:p>
-    <w:p>
-      <w:r>
-        <w:t>cd /</w:t>
-      </w:r>
-      <w:proofErr w:type="spellStart"/>
-      <w:r>
-        <w:t>opt</w:t>
-      </w:r>
-      <w:proofErr w:type="spellEnd"/>
-      <w:r>
-        <w:t xml:space="preserve"> </w:t>
-      </w:r>
-      <w:proofErr w:type="spellStart"/>
-      <w:r>
-        <w:t>git</w:t>
-      </w:r>
-      <w:proofErr w:type="spellEnd"/>
-      <w:r>
-        <w:t xml:space="preserve"> </w:t>
-      </w:r>
-      <w:proofErr w:type="spellStart"/>
-      <w:r>
-        <w:t>clone</w:t>
-      </w:r>
-      <w:proofErr w:type="spellEnd"/>
-      <w:r>
-        <w:t xml:space="preserve"> https://github.com/mailcow/mailcow-dockerized cd </w:t>
-      </w:r>
-      <w:proofErr w:type="spellStart"/>
-      <w:r>
-        <w:t>mailcow-dockerized</w:t>
-      </w:r>
-      <w:proofErr w:type="spellEnd"/>
-      <w:r>
-        <w:t xml:space="preserve"> </w:t>
-      </w:r>
-    </w:p>
-    <w:p>
-      <w:r>
-        <w:t>3.4. Konfiguráció generálása</w:t>
-      </w:r>
-    </w:p>
-    <w:p>
-      <w:r>
-        <w:t xml:space="preserve">./generate_config.sh </w:t>
-      </w:r>
-    </w:p>
-    <w:p>
-      <w:r>
-        <w:t xml:space="preserve">Itt megadtam a </w:t>
-      </w:r>
-      <w:proofErr w:type="spellStart"/>
-      <w:r>
-        <w:t>domaint</w:t>
-      </w:r>
-      <w:proofErr w:type="spellEnd"/>
-      <w:r>
-        <w:t>:</w:t>
-      </w:r>
-      <w:r>
-        <w:br/>
-      </w:r>
-      <w:proofErr w:type="spellStart"/>
+        <w:t>apt update &amp;&amp; apt upgrade -y</w:t>
+      </w:r>
+      <w:r>
+        <w:t xml:space="preserve"> paranccsal. Ez biztosította, hogy a legújabb csomagok és biztonsági frissítések telepítve legyenek. A frissítés után telepítettük a Docker Engine-t és a Docker Compose-t, amelyek a </w:t>
+      </w:r>
       <w:r>
         <w:rPr>
           <w:b/>
           <w:bCs/>
+          <w:color w:val="C00000"/>
+          <w:u w:val="single"/>
         </w:rPr>
-        <w:t>office.lan</w:t>
-      </w:r>
-      <w:proofErr w:type="spellEnd"/>
-    </w:p>
-    <w:p>
-      <w:r>
-        <w:t>3.5. IPv6 beállítás</w:t>
-      </w:r>
-    </w:p>
-    <w:p>
-      <w:r>
-        <w:t>A telepítő felismerte az IPv6-ot → engedélyezve maradt.</w:t>
-      </w:r>
-    </w:p>
-    <w:p>
-      <w:r>
-        <w:lastRenderedPageBreak/>
-        <w:t xml:space="preserve">3.6. </w:t>
-      </w:r>
-      <w:proofErr w:type="spellStart"/>
-      <w:r>
         <w:t>Mailcow</w:t>
       </w:r>
-      <w:proofErr w:type="spellEnd"/>
-      <w:r>
-        <w:t xml:space="preserve"> indítása</w:t>
-      </w:r>
-    </w:p>
-    <w:p>
-      <w:proofErr w:type="spellStart"/>
-      <w:r>
-        <w:t>docker</w:t>
-      </w:r>
-      <w:proofErr w:type="spellEnd"/>
-      <w:r>
-        <w:t xml:space="preserve"> </w:t>
-      </w:r>
-      <w:proofErr w:type="spellStart"/>
-      <w:r>
-        <w:t>compose</w:t>
-      </w:r>
-      <w:proofErr w:type="spellEnd"/>
-      <w:r>
-        <w:t xml:space="preserve"> </w:t>
-      </w:r>
-      <w:proofErr w:type="spellStart"/>
-      <w:r>
-        <w:t>pull</w:t>
-      </w:r>
-      <w:proofErr w:type="spellEnd"/>
-      <w:r>
-        <w:t xml:space="preserve"> </w:t>
-      </w:r>
-      <w:proofErr w:type="spellStart"/>
-      <w:r>
-        <w:t>docker</w:t>
-      </w:r>
-      <w:proofErr w:type="spellEnd"/>
-      <w:r>
-        <w:t xml:space="preserve"> </w:t>
-      </w:r>
-      <w:proofErr w:type="spellStart"/>
-      <w:r>
-        <w:t>compose</w:t>
-      </w:r>
-      <w:proofErr w:type="spellEnd"/>
-      <w:r>
-        <w:t xml:space="preserve"> </w:t>
-      </w:r>
-      <w:proofErr w:type="spellStart"/>
-      <w:r>
-        <w:t>up</w:t>
-      </w:r>
-      <w:proofErr w:type="spellEnd"/>
-      <w:r>
-        <w:t xml:space="preserve"> -d </w:t>
-      </w:r>
-    </w:p>
-    <w:p>
-      <w:r>
-        <w:t>A konténerek automatikusan indulnak rendszerindításkor.</w:t>
-      </w:r>
-    </w:p>
-    <w:p>
-      <w:r>
-        <w:t xml:space="preserve">4. Port </w:t>
-      </w:r>
-      <w:proofErr w:type="spellStart"/>
-      <w:r>
-        <w:t>Forwarding</w:t>
-      </w:r>
-      <w:proofErr w:type="spellEnd"/>
-      <w:r>
-        <w:t xml:space="preserve"> beállítása (</w:t>
-      </w:r>
-      <w:proofErr w:type="spellStart"/>
-      <w:r>
-        <w:t>VirtualBox</w:t>
-      </w:r>
-      <w:proofErr w:type="spellEnd"/>
-      <w:r>
-        <w:t>)</w:t>
-      </w:r>
-    </w:p>
-    <w:tbl>
-      <w:tblPr>
-        <w:tblW w:w="0" w:type="auto"/>
-        <w:tblCellSpacing w:w="15" w:type="dxa"/>
-        <w:tblCellMar>
-          <w:top w:w="15" w:type="dxa"/>
-          <w:left w:w="15" w:type="dxa"/>
-          <w:bottom w:w="15" w:type="dxa"/>
-          <w:right w:w="15" w:type="dxa"/>
-        </w:tblCellMar>
-        <w:tblLook w:val="04A0" w:firstRow="1" w:lastRow="0" w:firstColumn="1" w:lastColumn="0" w:noHBand="0" w:noVBand="1"/>
-      </w:tblPr>
-      <w:tblGrid>
-        <w:gridCol w:w="81"/>
-        <w:gridCol w:w="66"/>
-        <w:gridCol w:w="66"/>
-        <w:gridCol w:w="81"/>
-      </w:tblGrid>
-      <w:tr>
-        <w:trPr>
-          <w:tblHeader/>
-          <w:tblCellSpacing w:w="15" w:type="dxa"/>
-        </w:trPr>
-        <w:tc>
-          <w:tcPr>
-            <w:tcW w:w="0" w:type="auto"/>
-            <w:vAlign w:val="center"/>
-            <w:hideMark/>
-          </w:tcPr>
-          <w:p/>
-        </w:tc>
-        <w:tc>
-          <w:tcPr>
-            <w:tcW w:w="0" w:type="auto"/>
-            <w:vAlign w:val="center"/>
-            <w:hideMark/>
-          </w:tcPr>
-          <w:p/>
-        </w:tc>
-        <w:tc>
-          <w:tcPr>
-            <w:tcW w:w="0" w:type="auto"/>
-            <w:vAlign w:val="center"/>
-            <w:hideMark/>
-          </w:tcPr>
-          <w:p/>
-        </w:tc>
-        <w:tc>
-          <w:tcPr>
-            <w:tcW w:w="0" w:type="auto"/>
-            <w:vAlign w:val="center"/>
-            <w:hideMark/>
-          </w:tcPr>
-          <w:p/>
-        </w:tc>
-      </w:tr>
-      <w:tr>
-        <w:trPr>
-          <w:tblCellSpacing w:w="15" w:type="dxa"/>
-        </w:trPr>
-        <w:tc>
-          <w:tcPr>
-            <w:tcW w:w="0" w:type="auto"/>
-            <w:vAlign w:val="center"/>
-            <w:hideMark/>
-          </w:tcPr>
-          <w:p/>
-        </w:tc>
-        <w:tc>
-          <w:tcPr>
-            <w:tcW w:w="0" w:type="auto"/>
-            <w:vAlign w:val="center"/>
-            <w:hideMark/>
-          </w:tcPr>
-          <w:p/>
-        </w:tc>
-        <w:tc>
-          <w:tcPr>
-            <w:tcW w:w="0" w:type="auto"/>
-            <w:vAlign w:val="center"/>
-            <w:hideMark/>
-          </w:tcPr>
-          <w:p/>
-        </w:tc>
-        <w:tc>
-          <w:tcPr>
-            <w:tcW w:w="0" w:type="auto"/>
-            <w:vAlign w:val="center"/>
-            <w:hideMark/>
-          </w:tcPr>
-          <w:p/>
-        </w:tc>
-      </w:tr>
-      <w:tr>
-        <w:trPr>
-          <w:tblCellSpacing w:w="15" w:type="dxa"/>
-        </w:trPr>
-        <w:tc>
-          <w:tcPr>
-            <w:tcW w:w="0" w:type="auto"/>
-            <w:vAlign w:val="center"/>
-            <w:hideMark/>
-          </w:tcPr>
-          <w:p/>
-        </w:tc>
-        <w:tc>
-          <w:tcPr>
-            <w:tcW w:w="0" w:type="auto"/>
-            <w:vAlign w:val="center"/>
-            <w:hideMark/>
-          </w:tcPr>
-          <w:p/>
-        </w:tc>
-        <w:tc>
-          <w:tcPr>
-            <w:tcW w:w="0" w:type="auto"/>
-            <w:vAlign w:val="center"/>
-            <w:hideMark/>
-          </w:tcPr>
-          <w:p/>
-        </w:tc>
-        <w:tc>
-          <w:tcPr>
-            <w:tcW w:w="0" w:type="auto"/>
-            <w:vAlign w:val="center"/>
-            <w:hideMark/>
-          </w:tcPr>
-          <w:p/>
-        </w:tc>
-      </w:tr>
-    </w:tbl>
-    <w:p>
-      <w:r>
-        <w:t xml:space="preserve">Ez biztosítja, hogy a </w:t>
-      </w:r>
-      <w:proofErr w:type="spellStart"/>
-      <w:r>
-        <w:t>host</w:t>
-      </w:r>
-      <w:proofErr w:type="spellEnd"/>
-      <w:r>
-        <w:t xml:space="preserve"> gépről elérhető legyen a webes felület:</w:t>
-      </w:r>
-    </w:p>
-    <w:p>
-      <w:r>
-        <w:t xml:space="preserve">https://localhost:8443 </w:t>
-      </w:r>
-    </w:p>
-    <w:p>
-      <w:r>
-        <w:t xml:space="preserve">5. </w:t>
-      </w:r>
-      <w:proofErr w:type="spellStart"/>
-      <w:r>
-        <w:t>Domain</w:t>
-      </w:r>
-      <w:proofErr w:type="spellEnd"/>
-      <w:r>
-        <w:t xml:space="preserve"> létrehozása </w:t>
-      </w:r>
-      <w:proofErr w:type="spellStart"/>
-      <w:r>
-        <w:t>Mailcow</w:t>
-      </w:r>
-      <w:proofErr w:type="spellEnd"/>
-      <w:r>
-        <w:t>-ban</w:t>
-      </w:r>
-    </w:p>
-    <w:p>
-      <w:proofErr w:type="spellStart"/>
-      <w:r>
-        <w:t>Admin</w:t>
-      </w:r>
-      <w:proofErr w:type="spellEnd"/>
-      <w:r>
-        <w:t xml:space="preserve"> felület → </w:t>
-      </w:r>
-      <w:proofErr w:type="spellStart"/>
+      <w:r>
+        <w:t xml:space="preserve"> működésének alapját képezik. A telepítés után lefuttattuk a </w:t>
+      </w:r>
       <w:r>
         <w:rPr>
           <w:b/>
           <w:bCs/>
+          <w:i/>
+          <w:iCs/>
+          <w:highlight w:val="green"/>
         </w:rPr>
-        <w:t>Domains</w:t>
-      </w:r>
-      <w:proofErr w:type="spellEnd"/>
+        <w:t>docker --version</w:t>
+      </w:r>
+      <w:r>
+        <w:t xml:space="preserve"> és a </w:t>
+      </w:r>
       <w:r>
         <w:rPr>
           <w:b/>
           <w:bCs/>
+          <w:i/>
+          <w:iCs/>
+          <w:highlight w:val="green"/>
         </w:rPr>
-        <w:t xml:space="preserve"> → Add </w:t>
-      </w:r>
-      <w:proofErr w:type="spellStart"/>
+        <w:t>docker compose version</w:t>
+      </w:r>
+      <w:r>
+        <w:t xml:space="preserve"> parancsokat, hogy ellenőrizzük a telepítés sikerességét</w:t>
+      </w:r>
+      <w:r>
+        <w:t>.</w:t>
+      </w:r>
+    </w:p>
+    <w:p>
+      <w:pPr>
+        <w:jc w:val="center"/>
+      </w:pPr>
+      <w:r>
+        <w:drawing>
+          <wp:inline distT="0" distB="0" distL="0" distR="0" wp14:anchorId="5E70E85A" wp14:editId="78F9E1B1">
+            <wp:extent cx="4229690" cy="495369"/>
+            <wp:effectExtent l="0" t="0" r="0" b="0"/>
+            <wp:docPr id="1352847842" name="Kép 1" descr="A képen szöveg, Betűtípus, képernyőkép, Grafika látható&#10;&#10;Előfordulhat, hogy az AI által létrehozott tartalom helytelen."/>
+            <wp:cNvGraphicFramePr>
+              <a:graphicFrameLocks xmlns:a="http://schemas.openxmlformats.org/drawingml/2006/main" noChangeAspect="1"/>
+            </wp:cNvGraphicFramePr>
+            <a:graphic xmlns:a="http://schemas.openxmlformats.org/drawingml/2006/main">
+              <a:graphicData uri="http://schemas.openxmlformats.org/drawingml/2006/picture">
+                <pic:pic xmlns:pic="http://schemas.openxmlformats.org/drawingml/2006/picture">
+                  <pic:nvPicPr>
+                    <pic:cNvPr id="1352847842" name="Kép 1" descr="A képen szöveg, Betűtípus, képernyőkép, Grafika látható&#10;&#10;Előfordulhat, hogy az AI által létrehozott tartalom helytelen."/>
+                    <pic:cNvPicPr/>
+                  </pic:nvPicPr>
+                  <pic:blipFill>
+                    <a:blip r:embed="rId6"/>
+                    <a:stretch>
+                      <a:fillRect/>
+                    </a:stretch>
+                  </pic:blipFill>
+                  <pic:spPr>
+                    <a:xfrm>
+                      <a:off x="0" y="0"/>
+                      <a:ext cx="4229690" cy="495369"/>
+                    </a:xfrm>
+                    <a:prstGeom prst="rect">
+                      <a:avLst/>
+                    </a:prstGeom>
+                  </pic:spPr>
+                </pic:pic>
+              </a:graphicData>
+            </a:graphic>
+          </wp:inline>
+        </w:drawing>
+      </w:r>
+    </w:p>
+    <w:p>
+      <w:pPr>
+        <w:jc w:val="center"/>
+      </w:pPr>
+      <w:r>
+        <w:drawing>
+          <wp:inline distT="0" distB="0" distL="0" distR="0" wp14:anchorId="7807494C" wp14:editId="4A93D5EE">
+            <wp:extent cx="4315427" cy="457264"/>
+            <wp:effectExtent l="0" t="0" r="0" b="0"/>
+            <wp:docPr id="1004283531" name="Kép 1"/>
+            <wp:cNvGraphicFramePr>
+              <a:graphicFrameLocks xmlns:a="http://schemas.openxmlformats.org/drawingml/2006/main" noChangeAspect="1"/>
+            </wp:cNvGraphicFramePr>
+            <a:graphic xmlns:a="http://schemas.openxmlformats.org/drawingml/2006/main">
+              <a:graphicData uri="http://schemas.openxmlformats.org/drawingml/2006/picture">
+                <pic:pic xmlns:pic="http://schemas.openxmlformats.org/drawingml/2006/picture">
+                  <pic:nvPicPr>
+                    <pic:cNvPr id="1004283531" name=""/>
+                    <pic:cNvPicPr/>
+                  </pic:nvPicPr>
+                  <pic:blipFill>
+                    <a:blip r:embed="rId7"/>
+                    <a:stretch>
+                      <a:fillRect/>
+                    </a:stretch>
+                  </pic:blipFill>
+                  <pic:spPr>
+                    <a:xfrm>
+                      <a:off x="0" y="0"/>
+                      <a:ext cx="4315427" cy="457264"/>
+                    </a:xfrm>
+                    <a:prstGeom prst="rect">
+                      <a:avLst/>
+                    </a:prstGeom>
+                  </pic:spPr>
+                </pic:pic>
+              </a:graphicData>
+            </a:graphic>
+          </wp:inline>
+        </w:drawing>
+      </w:r>
+    </w:p>
+    <w:p>
+      <w:r>
+        <w:t xml:space="preserve">A következő lépésben létrehoztuk a Mailcow számára szükséges könyvtárat, majd letöltöttük a </w:t>
+      </w:r>
       <w:r>
         <w:rPr>
           <w:b/>
           <w:bCs/>
+          <w:color w:val="C00000"/>
+          <w:u w:val="single"/>
         </w:rPr>
-        <w:t>domain</w:t>
-      </w:r>
-      <w:proofErr w:type="spellEnd"/>
-    </w:p>
-    <w:p>
-      <w:r>
-        <w:t>Beállítások:</w:t>
-      </w:r>
-    </w:p>
-    <w:p>
-      <w:pPr>
-        <w:numPr>
-          <w:ilvl w:val="0"/>
-          <w:numId w:val="4"/>
-        </w:numPr>
-      </w:pPr>
-      <w:proofErr w:type="spellStart"/>
-      <w:r>
-        <w:t>Domain</w:t>
-      </w:r>
-      <w:proofErr w:type="spellEnd"/>
-      <w:r>
-        <w:t xml:space="preserve">: </w:t>
-      </w:r>
-      <w:proofErr w:type="spellStart"/>
-      <w:r>
-        <w:t>office.lan</w:t>
-      </w:r>
-      <w:proofErr w:type="spellEnd"/>
-    </w:p>
-    <w:p>
-      <w:pPr>
-        <w:numPr>
-          <w:ilvl w:val="0"/>
-          <w:numId w:val="4"/>
-        </w:numPr>
-      </w:pPr>
-      <w:r>
-        <w:t>Max postafiókok: 10</w:t>
-      </w:r>
-    </w:p>
-    <w:p>
-      <w:pPr>
-        <w:numPr>
-          <w:ilvl w:val="0"/>
-          <w:numId w:val="4"/>
-        </w:numPr>
-      </w:pPr>
-      <w:r>
-        <w:t xml:space="preserve">Max </w:t>
-      </w:r>
-      <w:proofErr w:type="spellStart"/>
-      <w:r>
-        <w:t>aliasok</w:t>
-      </w:r>
-      <w:proofErr w:type="spellEnd"/>
-      <w:r>
-        <w:t>: 400</w:t>
-      </w:r>
-    </w:p>
-    <w:p>
-      <w:pPr>
-        <w:numPr>
-          <w:ilvl w:val="0"/>
-          <w:numId w:val="4"/>
-        </w:numPr>
-      </w:pPr>
-      <w:r>
-        <w:t xml:space="preserve">Kvóta: 10240 </w:t>
-      </w:r>
-      <w:proofErr w:type="spellStart"/>
-      <w:r>
-        <w:t>MiB</w:t>
-      </w:r>
-      <w:proofErr w:type="spellEnd"/>
-    </w:p>
-    <w:p>
-      <w:pPr>
-        <w:numPr>
-          <w:ilvl w:val="0"/>
-          <w:numId w:val="4"/>
-        </w:numPr>
-      </w:pPr>
-      <w:r>
-        <w:t>DKIM: 2048 bit</w:t>
-      </w:r>
-    </w:p>
-    <w:p>
-      <w:pPr>
-        <w:numPr>
-          <w:ilvl w:val="0"/>
-          <w:numId w:val="4"/>
-        </w:numPr>
-      </w:pPr>
-      <w:r>
-        <w:t>Globális címlista: engedélyezve</w:t>
-      </w:r>
-    </w:p>
-    <w:p>
-      <w:pPr>
-        <w:numPr>
-          <w:ilvl w:val="0"/>
-          <w:numId w:val="4"/>
-        </w:numPr>
-      </w:pPr>
-      <w:r>
-        <w:t>Aktív: igen</w:t>
-      </w:r>
-    </w:p>
-    <w:p>
-      <w:r>
-        <w:t xml:space="preserve">A </w:t>
-      </w:r>
-      <w:proofErr w:type="spellStart"/>
-      <w:r>
-        <w:t>domain</w:t>
-      </w:r>
-      <w:proofErr w:type="spellEnd"/>
-      <w:r>
-        <w:t xml:space="preserve"> mentése után a </w:t>
-      </w:r>
-      <w:proofErr w:type="spellStart"/>
-      <w:r>
-        <w:t>SOGo</w:t>
-      </w:r>
-      <w:proofErr w:type="spellEnd"/>
-      <w:r>
-        <w:t xml:space="preserve"> konténert újra kellett indítani.</w:t>
-      </w:r>
-    </w:p>
-    <w:p>
-      <w:r>
-        <w:t>6. Postafiók létrehozása</w:t>
-      </w:r>
-    </w:p>
-    <w:p>
-      <w:proofErr w:type="spellStart"/>
-      <w:r>
-        <w:t>Admin</w:t>
-      </w:r>
-      <w:proofErr w:type="spellEnd"/>
-      <w:r>
-        <w:t xml:space="preserve"> felület → </w:t>
-      </w:r>
-      <w:proofErr w:type="spellStart"/>
+        <w:t>Mailcow Dockerized</w:t>
+      </w:r>
+      <w:r>
+        <w:t xml:space="preserve"> csomagot a GitHubról. A letöltés után beléptünk a mailcow-dockerized mappába, ahol elindítottuk a </w:t>
+      </w:r>
       <w:r>
         <w:rPr>
           <w:b/>
           <w:bCs/>
+          <w:i/>
+          <w:iCs/>
+          <w:highlight w:val="green"/>
         </w:rPr>
-        <w:t>Mailboxes</w:t>
-      </w:r>
-      <w:proofErr w:type="spellEnd"/>
+        <w:t>./generate_config.sh</w:t>
+      </w:r>
+      <w:r>
+        <w:t xml:space="preserve"> konfigurációs generátort. </w:t>
+      </w:r>
+    </w:p>
+    <w:p>
+      <w:r>
+        <w:t xml:space="preserve">A konfiguráció elkészülte után a Mailcow konténereinek letöltése következett a </w:t>
+      </w:r>
       <w:r>
         <w:rPr>
           <w:b/>
           <w:bCs/>
+          <w:i/>
+          <w:iCs/>
+          <w:highlight w:val="green"/>
         </w:rPr>
-        <w:t xml:space="preserve"> → Add </w:t>
-      </w:r>
-      <w:proofErr w:type="spellStart"/>
+        <w:t>docker compose pull</w:t>
+      </w:r>
+      <w:r>
+        <w:t xml:space="preserve"> paranccsal, majd a teljes rendszer indítása a </w:t>
+      </w:r>
       <w:r>
         <w:rPr>
           <w:b/>
           <w:bCs/>
+          <w:i/>
+          <w:iCs/>
+          <w:highlight w:val="green"/>
         </w:rPr>
-        <w:t>mailbox</w:t>
-      </w:r>
-      <w:proofErr w:type="spellEnd"/>
-    </w:p>
-    <w:p>
-      <w:r>
-        <w:t>Példa:</w:t>
-      </w:r>
-    </w:p>
-    <w:p>
-      <w:pPr>
-        <w:numPr>
-          <w:ilvl w:val="0"/>
-          <w:numId w:val="5"/>
-        </w:numPr>
-      </w:pPr>
-      <w:r>
-        <w:t>Felhasználónév: teszt1</w:t>
-      </w:r>
-    </w:p>
-    <w:p>
-      <w:pPr>
-        <w:numPr>
-          <w:ilvl w:val="0"/>
-          <w:numId w:val="5"/>
-        </w:numPr>
-      </w:pPr>
-      <w:r>
-        <w:t>Email: teszt1@office.lan</w:t>
-      </w:r>
-    </w:p>
-    <w:p>
-      <w:pPr>
-        <w:numPr>
-          <w:ilvl w:val="0"/>
-          <w:numId w:val="5"/>
-        </w:numPr>
-      </w:pPr>
-      <w:r>
-        <w:t>Teljes név: Teszt Felhasználó</w:t>
-      </w:r>
-    </w:p>
-    <w:p>
-      <w:pPr>
-        <w:numPr>
-          <w:ilvl w:val="0"/>
-          <w:numId w:val="5"/>
-        </w:numPr>
-      </w:pPr>
-      <w:r>
-        <w:t>Jelszó: Teszt123!</w:t>
-      </w:r>
-    </w:p>
-    <w:p>
-      <w:pPr>
-        <w:numPr>
-          <w:ilvl w:val="0"/>
-          <w:numId w:val="5"/>
-        </w:numPr>
-      </w:pPr>
-      <w:r>
-        <w:t xml:space="preserve">Kvóta: 1024 </w:t>
-      </w:r>
-      <w:proofErr w:type="spellStart"/>
-      <w:r>
-        <w:t>MiB</w:t>
-      </w:r>
-      <w:proofErr w:type="spellEnd"/>
-    </w:p>
-    <w:p>
-      <w:r>
-        <w:t>7. Webmail tesztelése</w:t>
-      </w:r>
-    </w:p>
-    <w:p>
-      <w:r>
-        <w:t xml:space="preserve">7.1. </w:t>
-      </w:r>
-      <w:proofErr w:type="spellStart"/>
-      <w:r>
-        <w:t>Roundcube</w:t>
-      </w:r>
-      <w:proofErr w:type="spellEnd"/>
-      <w:r>
-        <w:t xml:space="preserve"> elérése</w:t>
-      </w:r>
-    </w:p>
-    <w:p>
-      <w:r>
-        <w:t xml:space="preserve">https://localhost:8443/roundcube </w:t>
-      </w:r>
-    </w:p>
-    <w:p>
-      <w:r>
-        <w:lastRenderedPageBreak/>
-        <w:t>7.2. Bejelentkezés</w:t>
-      </w:r>
-    </w:p>
-    <w:p>
-      <w:pPr>
-        <w:numPr>
-          <w:ilvl w:val="0"/>
-          <w:numId w:val="6"/>
-        </w:numPr>
-      </w:pPr>
-      <w:r>
-        <w:t>Email: teszt1@office.lan</w:t>
-      </w:r>
-    </w:p>
-    <w:p>
-      <w:pPr>
-        <w:numPr>
-          <w:ilvl w:val="0"/>
-          <w:numId w:val="6"/>
-        </w:numPr>
-      </w:pPr>
-      <w:r>
-        <w:t>Jelszó: Teszt123!</w:t>
-      </w:r>
-    </w:p>
-    <w:p>
-      <w:r>
-        <w:t>7.3. Tesztlevél küldése</w:t>
-      </w:r>
-    </w:p>
-    <w:p>
-      <w:pPr>
-        <w:numPr>
-          <w:ilvl w:val="0"/>
-          <w:numId w:val="7"/>
-        </w:numPr>
-      </w:pPr>
-      <w:r>
-        <w:t>Címzett: saját email cím</w:t>
-      </w:r>
-    </w:p>
-    <w:p>
-      <w:pPr>
-        <w:numPr>
-          <w:ilvl w:val="0"/>
-          <w:numId w:val="7"/>
-        </w:numPr>
-      </w:pPr>
-      <w:r>
-        <w:t>Tárgy: Teszt</w:t>
-      </w:r>
-    </w:p>
-    <w:p>
-      <w:pPr>
-        <w:numPr>
-          <w:ilvl w:val="0"/>
-          <w:numId w:val="7"/>
-        </w:numPr>
-      </w:pPr>
-      <w:r>
-        <w:t>Eredmény: levél sikeresen megérkezett</w:t>
-      </w:r>
-    </w:p>
-    <w:p>
-      <w:r>
-        <w:t>7.4. Spam szűrés tesztelése</w:t>
-      </w:r>
-    </w:p>
-    <w:p>
-      <w:r>
-        <w:t>Spamgyanús szavakkal küldött levél → „Levélszemét” mappába került.</w:t>
-      </w:r>
-    </w:p>
-    <w:p>
-      <w:r>
-        <w:t>8. Rendszer működése előadás közben</w:t>
-      </w:r>
-    </w:p>
-    <w:p>
-      <w:r>
-        <w:t xml:space="preserve">A bemutatóhoz </w:t>
+        <w:t>docker compose up -d</w:t>
+      </w:r>
+      <w:r>
+        <w:t xml:space="preserve"> segítségével. Ez a parancs elindította az összes szükséges konténert, többek között a Postfix, Dovecot, MariaDB, Nginx, SOGo, Roundcube, ClamAV és SpamAssassin szolgáltatásokat. A konténerek állapotát a </w:t>
       </w:r>
       <w:r>
         <w:rPr>
           <w:b/>
           <w:bCs/>
+          <w:i/>
+          <w:iCs/>
+          <w:highlight w:val="green"/>
         </w:rPr>
-        <w:t xml:space="preserve">csak a </w:t>
-      </w:r>
-      <w:proofErr w:type="spellStart"/>
+        <w:t>docker compose ps</w:t>
+      </w:r>
+      <w:r>
+        <w:t xml:space="preserve"> paranccsal ellenőriztük.</w:t>
+      </w:r>
+    </w:p>
+    <w:p>
+      <w:pPr>
+        <w:jc w:val="center"/>
+      </w:pPr>
+      <w:r>
+        <w:lastRenderedPageBreak/>
+        <w:drawing>
+          <wp:inline distT="0" distB="0" distL="0" distR="0" wp14:anchorId="739FCD61" wp14:editId="4AFB5423">
+            <wp:extent cx="4396740" cy="2925345"/>
+            <wp:effectExtent l="0" t="0" r="3810" b="8890"/>
+            <wp:docPr id="504119570" name="Kép 1" descr="A képen szöveg, képernyőkép, Betűtípus látható&#10;&#10;Előfordulhat, hogy az AI által létrehozott tartalom helytelen."/>
+            <wp:cNvGraphicFramePr>
+              <a:graphicFrameLocks xmlns:a="http://schemas.openxmlformats.org/drawingml/2006/main" noChangeAspect="1"/>
+            </wp:cNvGraphicFramePr>
+            <a:graphic xmlns:a="http://schemas.openxmlformats.org/drawingml/2006/main">
+              <a:graphicData uri="http://schemas.openxmlformats.org/drawingml/2006/picture">
+                <pic:pic xmlns:pic="http://schemas.openxmlformats.org/drawingml/2006/picture">
+                  <pic:nvPicPr>
+                    <pic:cNvPr id="504119570" name="Kép 1" descr="A képen szöveg, képernyőkép, Betűtípus látható&#10;&#10;Előfordulhat, hogy az AI által létrehozott tartalom helytelen."/>
+                    <pic:cNvPicPr/>
+                  </pic:nvPicPr>
+                  <pic:blipFill>
+                    <a:blip r:embed="rId8"/>
+                    <a:stretch>
+                      <a:fillRect/>
+                    </a:stretch>
+                  </pic:blipFill>
+                  <pic:spPr>
+                    <a:xfrm>
+                      <a:off x="0" y="0"/>
+                      <a:ext cx="4422416" cy="2942428"/>
+                    </a:xfrm>
+                    <a:prstGeom prst="rect">
+                      <a:avLst/>
+                    </a:prstGeom>
+                  </pic:spPr>
+                </pic:pic>
+              </a:graphicData>
+            </a:graphic>
+          </wp:inline>
+        </w:drawing>
+      </w:r>
+    </w:p>
+    <w:p>
+      <w:pPr>
+        <w:jc w:val="center"/>
+      </w:pPr>
+      <w:r>
+        <w:drawing>
+          <wp:inline distT="0" distB="0" distL="0" distR="0" wp14:anchorId="6A4CDD9E" wp14:editId="6F90CB44">
+            <wp:extent cx="5704134" cy="1280160"/>
+            <wp:effectExtent l="0" t="0" r="0" b="0"/>
+            <wp:docPr id="368315271" name="Kép 1" descr="A képen szöveg, képernyőkép, Betűtípus, fekete látható&#10;&#10;Előfordulhat, hogy az AI által létrehozott tartalom helytelen."/>
+            <wp:cNvGraphicFramePr>
+              <a:graphicFrameLocks xmlns:a="http://schemas.openxmlformats.org/drawingml/2006/main" noChangeAspect="1"/>
+            </wp:cNvGraphicFramePr>
+            <a:graphic xmlns:a="http://schemas.openxmlformats.org/drawingml/2006/main">
+              <a:graphicData uri="http://schemas.openxmlformats.org/drawingml/2006/picture">
+                <pic:pic xmlns:pic="http://schemas.openxmlformats.org/drawingml/2006/picture">
+                  <pic:nvPicPr>
+                    <pic:cNvPr id="368315271" name="Kép 1" descr="A képen szöveg, képernyőkép, Betűtípus, fekete látható&#10;&#10;Előfordulhat, hogy az AI által létrehozott tartalom helytelen."/>
+                    <pic:cNvPicPr/>
+                  </pic:nvPicPr>
+                  <pic:blipFill>
+                    <a:blip r:embed="rId9"/>
+                    <a:stretch>
+                      <a:fillRect/>
+                    </a:stretch>
+                  </pic:blipFill>
+                  <pic:spPr>
+                    <a:xfrm>
+                      <a:off x="0" y="0"/>
+                      <a:ext cx="5795157" cy="1300588"/>
+                    </a:xfrm>
+                    <a:prstGeom prst="rect">
+                      <a:avLst/>
+                    </a:prstGeom>
+                  </pic:spPr>
+                </pic:pic>
+              </a:graphicData>
+            </a:graphic>
+          </wp:inline>
+        </w:drawing>
+      </w:r>
+    </w:p>
+    <w:p>
+      <w:r>
+        <w:t xml:space="preserve">A VirtualBox NAT hálózati módját porttovábbítással egészítettük ki, hogy a host gépről elérhető legyen a Mailcow webes felülete. A </w:t>
+      </w:r>
       <w:r>
         <w:rPr>
           <w:b/>
           <w:bCs/>
+          <w:color w:val="C00000"/>
         </w:rPr>
-        <w:t>VirtualBox</w:t>
-      </w:r>
-      <w:proofErr w:type="spellEnd"/>
+        <w:t>8080</w:t>
+      </w:r>
+      <w:r>
+        <w:t xml:space="preserve">-as portot a </w:t>
+      </w:r>
       <w:r>
         <w:rPr>
           <w:b/>
           <w:bCs/>
+          <w:color w:val="C00000"/>
         </w:rPr>
-        <w:t xml:space="preserve"> gépet kell elindítani</w:t>
-      </w:r>
-      <w:r>
-        <w:t>.</w:t>
-      </w:r>
-      <w:r>
-        <w:br/>
-        <w:t xml:space="preserve">A Docker és a </w:t>
-      </w:r>
-      <w:proofErr w:type="spellStart"/>
-      <w:r>
-        <w:t>Mailcow</w:t>
-      </w:r>
-      <w:proofErr w:type="spellEnd"/>
-      <w:r>
-        <w:t xml:space="preserve"> automatikusan indul.</w:t>
+        <w:t>80</w:t>
+      </w:r>
+      <w:r>
+        <w:t xml:space="preserve">-as portra, a </w:t>
+      </w:r>
+      <w:r>
+        <w:rPr>
+          <w:color w:val="3A7C22" w:themeColor="accent6" w:themeShade="BF"/>
+        </w:rPr>
+        <w:t>8443</w:t>
+      </w:r>
+      <w:r>
+        <w:t xml:space="preserve">-as portot pedig a </w:t>
+      </w:r>
+      <w:r>
+        <w:rPr>
+          <w:color w:val="3A7C22" w:themeColor="accent6" w:themeShade="BF"/>
+        </w:rPr>
+        <w:t>443</w:t>
+      </w:r>
+      <w:r>
+        <w:t>-as portra irányítottuk át.</w:t>
       </w:r>
     </w:p>
     <w:p>
-      <w:r>
-        <w:t>Elég megnyitni:</w:t>
+      <w:pPr>
+        <w:jc w:val="center"/>
+      </w:pPr>
+      <w:r>
+        <w:drawing>
+          <wp:inline distT="0" distB="0" distL="0" distR="0" wp14:anchorId="25CEF35F" wp14:editId="6ECB5CD7">
+            <wp:extent cx="5760720" cy="3642360"/>
+            <wp:effectExtent l="0" t="0" r="0" b="0"/>
+            <wp:docPr id="1797138935" name="Kép 1" descr="A képen szöveg, képernyőkép, szoftver, Multimédiás szoftver látható&#10;&#10;Előfordulhat, hogy az AI által létrehozott tartalom helytelen."/>
+            <wp:cNvGraphicFramePr>
+              <a:graphicFrameLocks xmlns:a="http://schemas.openxmlformats.org/drawingml/2006/main" noChangeAspect="1"/>
+            </wp:cNvGraphicFramePr>
+            <a:graphic xmlns:a="http://schemas.openxmlformats.org/drawingml/2006/main">
+              <a:graphicData uri="http://schemas.openxmlformats.org/drawingml/2006/picture">
+                <pic:pic xmlns:pic="http://schemas.openxmlformats.org/drawingml/2006/picture">
+                  <pic:nvPicPr>
+                    <pic:cNvPr id="1797138935" name="Kép 1" descr="A képen szöveg, képernyőkép, szoftver, Multimédiás szoftver látható&#10;&#10;Előfordulhat, hogy az AI által létrehozott tartalom helytelen."/>
+                    <pic:cNvPicPr/>
+                  </pic:nvPicPr>
+                  <pic:blipFill>
+                    <a:blip r:embed="rId10"/>
+                    <a:stretch>
+                      <a:fillRect/>
+                    </a:stretch>
+                  </pic:blipFill>
+                  <pic:spPr>
+                    <a:xfrm>
+                      <a:off x="0" y="0"/>
+                      <a:ext cx="5760720" cy="3642360"/>
+                    </a:xfrm>
+                    <a:prstGeom prst="rect">
+                      <a:avLst/>
+                    </a:prstGeom>
+                  </pic:spPr>
+                </pic:pic>
+              </a:graphicData>
+            </a:graphic>
+          </wp:inline>
+        </w:drawing>
       </w:r>
     </w:p>
     <w:p>
       <w:r>
-        <w:t xml:space="preserve">https://localhost:8443 </w:t>
+        <w:lastRenderedPageBreak/>
+        <w:t xml:space="preserve">Miután a konténerek elindultak, megnyitottuk a böngészőt, és a https://localhost:8443 címen elértük a Mailcow admin felületét. A bejelentkezés után létrehoztuk az </w:t>
+      </w:r>
+      <w:r>
+        <w:rPr>
+          <w:b/>
+          <w:bCs/>
+          <w:i/>
+          <w:iCs/>
+          <w:highlight w:val="green"/>
+        </w:rPr>
+        <w:t>„office.lan”</w:t>
+      </w:r>
+      <w:r>
+        <w:t xml:space="preserve"> domaint, beállítottuk a kvótákat, a maximális postafiókszámot, valamint engedélyeztük a DKIM aláírást.</w:t>
       </w:r>
     </w:p>
     <w:p>
-      <w:r>
-        <w:t xml:space="preserve">És máris működik az </w:t>
-      </w:r>
-      <w:proofErr w:type="spellStart"/>
-      <w:r>
-        <w:t>admin</w:t>
-      </w:r>
-      <w:proofErr w:type="spellEnd"/>
-      <w:r>
-        <w:t xml:space="preserve"> és a webmail.</w:t>
+      <w:pPr>
+        <w:jc w:val="center"/>
+      </w:pPr>
+      <w:r>
+        <w:drawing>
+          <wp:inline distT="0" distB="0" distL="0" distR="0" wp14:anchorId="3213E408" wp14:editId="1622163B">
+            <wp:extent cx="5760720" cy="1748790"/>
+            <wp:effectExtent l="0" t="0" r="0" b="3810"/>
+            <wp:docPr id="548484775" name="Kép 1" descr="A képen szöveg, szoftver, Multimédiás szoftver, Grafikai szoftver látható&#10;&#10;Előfordulhat, hogy az AI által létrehozott tartalom helytelen."/>
+            <wp:cNvGraphicFramePr>
+              <a:graphicFrameLocks xmlns:a="http://schemas.openxmlformats.org/drawingml/2006/main" noChangeAspect="1"/>
+            </wp:cNvGraphicFramePr>
+            <a:graphic xmlns:a="http://schemas.openxmlformats.org/drawingml/2006/main">
+              <a:graphicData uri="http://schemas.openxmlformats.org/drawingml/2006/picture">
+                <pic:pic xmlns:pic="http://schemas.openxmlformats.org/drawingml/2006/picture">
+                  <pic:nvPicPr>
+                    <pic:cNvPr id="548484775" name="Kép 1" descr="A képen szöveg, szoftver, Multimédiás szoftver, Grafikai szoftver látható&#10;&#10;Előfordulhat, hogy az AI által létrehozott tartalom helytelen."/>
+                    <pic:cNvPicPr/>
+                  </pic:nvPicPr>
+                  <pic:blipFill>
+                    <a:blip r:embed="rId11"/>
+                    <a:stretch>
+                      <a:fillRect/>
+                    </a:stretch>
+                  </pic:blipFill>
+                  <pic:spPr>
+                    <a:xfrm>
+                      <a:off x="0" y="0"/>
+                      <a:ext cx="5760720" cy="1748790"/>
+                    </a:xfrm>
+                    <a:prstGeom prst="rect">
+                      <a:avLst/>
+                    </a:prstGeom>
+                  </pic:spPr>
+                </pic:pic>
+              </a:graphicData>
+            </a:graphic>
+          </wp:inline>
+        </w:drawing>
       </w:r>
     </w:p>
     <w:p>
       <w:r>
-        <w:t>9. Összegzés</w:t>
+        <w:t xml:space="preserve">A domain létrehozása után hozzáadtuk az első postafiókot, a </w:t>
+      </w:r>
+      <w:r>
+        <w:rPr>
+          <w:b/>
+          <w:bCs/>
+          <w:i/>
+          <w:iCs/>
+          <w:highlight w:val="green"/>
+        </w:rPr>
+        <w:t>„teszt1@office.lan”</w:t>
+      </w:r>
+      <w:r>
+        <w:t xml:space="preserve"> címet. Beállítottuk a felhasználó nevét, jelszavát és tárhelykvótáját.</w:t>
       </w:r>
     </w:p>
     <w:p>
-      <w:r>
-        <w:t>A projekt eredményeként létrejött egy:</w:t>
+      <w:pPr>
+        <w:jc w:val="center"/>
+      </w:pPr>
+      <w:r>
+        <w:drawing>
+          <wp:inline distT="0" distB="0" distL="0" distR="0" wp14:anchorId="031CCFFB" wp14:editId="4E14C138">
+            <wp:extent cx="5760720" cy="1492250"/>
+            <wp:effectExtent l="0" t="0" r="0" b="0"/>
+            <wp:docPr id="1312738099" name="Kép 1" descr="A képen Multimédiás szoftver, szoftver, Grafikai szoftver, képernyőkép látható&#10;&#10;Előfordulhat, hogy az AI által létrehozott tartalom helytelen."/>
+            <wp:cNvGraphicFramePr>
+              <a:graphicFrameLocks xmlns:a="http://schemas.openxmlformats.org/drawingml/2006/main" noChangeAspect="1"/>
+            </wp:cNvGraphicFramePr>
+            <a:graphic xmlns:a="http://schemas.openxmlformats.org/drawingml/2006/main">
+              <a:graphicData uri="http://schemas.openxmlformats.org/drawingml/2006/picture">
+                <pic:pic xmlns:pic="http://schemas.openxmlformats.org/drawingml/2006/picture">
+                  <pic:nvPicPr>
+                    <pic:cNvPr id="1312738099" name="Kép 1" descr="A képen Multimédiás szoftver, szoftver, Grafikai szoftver, képernyőkép látható&#10;&#10;Előfordulhat, hogy az AI által létrehozott tartalom helytelen."/>
+                    <pic:cNvPicPr/>
+                  </pic:nvPicPr>
+                  <pic:blipFill>
+                    <a:blip r:embed="rId12"/>
+                    <a:stretch>
+                      <a:fillRect/>
+                    </a:stretch>
+                  </pic:blipFill>
+                  <pic:spPr>
+                    <a:xfrm>
+                      <a:off x="0" y="0"/>
+                      <a:ext cx="5760720" cy="1492250"/>
+                    </a:xfrm>
+                    <a:prstGeom prst="rect">
+                      <a:avLst/>
+                    </a:prstGeom>
+                  </pic:spPr>
+                </pic:pic>
+              </a:graphicData>
+            </a:graphic>
+          </wp:inline>
+        </w:drawing>
       </w:r>
     </w:p>
     <w:p>
-      <w:pPr>
-        <w:numPr>
-          <w:ilvl w:val="0"/>
-          <w:numId w:val="8"/>
-        </w:numPr>
-      </w:pPr>
-      <w:r>
-        <w:t>stabil</w:t>
+      <w:r>
+        <w:t>A következő lépésben megnyitottuk a Roundcube webmail felületét a https://localhost:8443/roundcube címen, majd bejelentkeztünk a frissen létrehozott postafiókkal. Küldtünk egy tesztlevelet saját magunknak, amely sikeresen megérkezett a bejövő mappába.</w:t>
       </w:r>
     </w:p>
     <w:p>
       <w:pPr>
-        <w:numPr>
-          <w:ilvl w:val="0"/>
-          <w:numId w:val="8"/>
-        </w:numPr>
-      </w:pPr>
-      <w:r>
-        <w:t>biztonságos</w:t>
+        <w:jc w:val="center"/>
+      </w:pPr>
+      <w:r>
+        <w:drawing>
+          <wp:inline distT="0" distB="0" distL="0" distR="0" wp14:anchorId="1811E0AF" wp14:editId="5342451C">
+            <wp:extent cx="2684130" cy="2918460"/>
+            <wp:effectExtent l="0" t="0" r="2540" b="0"/>
+            <wp:docPr id="103353677" name="Kép 1" descr="A képen szöveg, képernyőkép, szoftver, Operációs rendszer látható&#10;&#10;Előfordulhat, hogy az AI által létrehozott tartalom helytelen."/>
+            <wp:cNvGraphicFramePr>
+              <a:graphicFrameLocks xmlns:a="http://schemas.openxmlformats.org/drawingml/2006/main" noChangeAspect="1"/>
+            </wp:cNvGraphicFramePr>
+            <a:graphic xmlns:a="http://schemas.openxmlformats.org/drawingml/2006/main">
+              <a:graphicData uri="http://schemas.openxmlformats.org/drawingml/2006/picture">
+                <pic:pic xmlns:pic="http://schemas.openxmlformats.org/drawingml/2006/picture">
+                  <pic:nvPicPr>
+                    <pic:cNvPr id="103353677" name="Kép 1" descr="A képen szöveg, képernyőkép, szoftver, Operációs rendszer látható&#10;&#10;Előfordulhat, hogy az AI által létrehozott tartalom helytelen."/>
+                    <pic:cNvPicPr/>
+                  </pic:nvPicPr>
+                  <pic:blipFill>
+                    <a:blip r:embed="rId13"/>
+                    <a:stretch>
+                      <a:fillRect/>
+                    </a:stretch>
+                  </pic:blipFill>
+                  <pic:spPr>
+                    <a:xfrm>
+                      <a:off x="0" y="0"/>
+                      <a:ext cx="2733041" cy="2971641"/>
+                    </a:xfrm>
+                    <a:prstGeom prst="rect">
+                      <a:avLst/>
+                    </a:prstGeom>
+                  </pic:spPr>
+                </pic:pic>
+              </a:graphicData>
+            </a:graphic>
+          </wp:inline>
+        </w:drawing>
       </w:r>
     </w:p>
     <w:p>
-      <w:pPr>
-        <w:numPr>
-          <w:ilvl w:val="0"/>
-          <w:numId w:val="8"/>
-        </w:numPr>
-      </w:pPr>
-      <w:r>
-        <w:t>modern</w:t>
+      <w:r>
+        <w:lastRenderedPageBreak/>
+        <w:tab/>
+      </w:r>
+      <w:r>
+        <w:drawing>
+          <wp:inline distT="0" distB="0" distL="0" distR="0" wp14:anchorId="1B3D6B05" wp14:editId="05A54206">
+            <wp:extent cx="5760720" cy="2962910"/>
+            <wp:effectExtent l="0" t="0" r="0" b="8890"/>
+            <wp:docPr id="1260009885" name="Kép 1" descr="A képen szöveg, képernyőkép, szoftver, Számítógépes ikon látható&#10;&#10;Előfordulhat, hogy az AI által létrehozott tartalom helytelen."/>
+            <wp:cNvGraphicFramePr>
+              <a:graphicFrameLocks xmlns:a="http://schemas.openxmlformats.org/drawingml/2006/main" noChangeAspect="1"/>
+            </wp:cNvGraphicFramePr>
+            <a:graphic xmlns:a="http://schemas.openxmlformats.org/drawingml/2006/main">
+              <a:graphicData uri="http://schemas.openxmlformats.org/drawingml/2006/picture">
+                <pic:pic xmlns:pic="http://schemas.openxmlformats.org/drawingml/2006/picture">
+                  <pic:nvPicPr>
+                    <pic:cNvPr id="1260009885" name="Kép 1" descr="A képen szöveg, képernyőkép, szoftver, Számítógépes ikon látható&#10;&#10;Előfordulhat, hogy az AI által létrehozott tartalom helytelen."/>
+                    <pic:cNvPicPr/>
+                  </pic:nvPicPr>
+                  <pic:blipFill>
+                    <a:blip r:embed="rId14"/>
+                    <a:stretch>
+                      <a:fillRect/>
+                    </a:stretch>
+                  </pic:blipFill>
+                  <pic:spPr>
+                    <a:xfrm>
+                      <a:off x="0" y="0"/>
+                      <a:ext cx="5760720" cy="2962910"/>
+                    </a:xfrm>
+                    <a:prstGeom prst="rect">
+                      <a:avLst/>
+                    </a:prstGeom>
+                  </pic:spPr>
+                </pic:pic>
+              </a:graphicData>
+            </a:graphic>
+          </wp:inline>
+        </w:drawing>
       </w:r>
     </w:p>
     <w:p>
-      <w:pPr>
-        <w:numPr>
-          <w:ilvl w:val="0"/>
-          <w:numId w:val="8"/>
-        </w:numPr>
-      </w:pPr>
-      <w:proofErr w:type="spellStart"/>
-      <w:r>
-        <w:t>konténerizált</w:t>
-      </w:r>
-      <w:proofErr w:type="spellEnd"/>
+      <w:r>
+        <w:t>A rendszer működésének ellenőrzése után megállapítottuk, hogy a Mailcow szerver stabilan és hibamentesen működik. A Docker konténerek automatikusan újraindulnak a rendszer indulásakor, így a szerver minden újraindítás után azonnal használatra kész. A webes felület és a levelezési funkciók egyaránt megfelelően működnek</w:t>
+      </w:r>
+      <w:r>
+        <w:t>.</w:t>
+      </w:r>
     </w:p>
-    <w:p>
-      <w:pPr>
-        <w:numPr>
-          <w:ilvl w:val="0"/>
-          <w:numId w:val="8"/>
-        </w:numPr>
-      </w:pPr>
-      <w:r>
-        <w:t>könnyen kezelhető</w:t>
-      </w:r>
-    </w:p>
-    <w:p>
-      <w:r>
-        <w:t>levelezőszerver, amely alkalmas belső vállalati vagy oktatási környezetben történő használatra.</w:t>
-      </w:r>
-    </w:p>
-    <w:p>
-      <w:r>
-        <w:t xml:space="preserve">A </w:t>
-      </w:r>
-      <w:proofErr w:type="spellStart"/>
-      <w:r>
-        <w:t>Mailcow</w:t>
-      </w:r>
-      <w:proofErr w:type="spellEnd"/>
-      <w:r>
-        <w:t xml:space="preserve"> előnyei:</w:t>
-      </w:r>
-    </w:p>
-    <w:p>
-      <w:pPr>
-        <w:numPr>
-          <w:ilvl w:val="0"/>
-          <w:numId w:val="9"/>
-        </w:numPr>
-      </w:pPr>
-      <w:r>
-        <w:t>DKIM, SPF, DMARC támogatás</w:t>
-      </w:r>
-    </w:p>
-    <w:p>
-      <w:pPr>
-        <w:numPr>
-          <w:ilvl w:val="0"/>
-          <w:numId w:val="9"/>
-        </w:numPr>
-      </w:pPr>
-      <w:r>
-        <w:t>Webmail (</w:t>
-      </w:r>
-      <w:proofErr w:type="spellStart"/>
-      <w:r>
-        <w:t>Roundcube</w:t>
-      </w:r>
-      <w:proofErr w:type="spellEnd"/>
-      <w:r>
-        <w:t xml:space="preserve">, </w:t>
-      </w:r>
-      <w:proofErr w:type="spellStart"/>
-      <w:r>
-        <w:t>SOGo</w:t>
-      </w:r>
-      <w:proofErr w:type="spellEnd"/>
-      <w:r>
-        <w:t>)</w:t>
-      </w:r>
-    </w:p>
-    <w:p>
-      <w:pPr>
-        <w:numPr>
-          <w:ilvl w:val="0"/>
-          <w:numId w:val="9"/>
-        </w:numPr>
-      </w:pPr>
-      <w:proofErr w:type="spellStart"/>
-      <w:r>
-        <w:t>SpamAssassin</w:t>
-      </w:r>
-      <w:proofErr w:type="spellEnd"/>
-      <w:r>
-        <w:t xml:space="preserve"> + </w:t>
-      </w:r>
-      <w:proofErr w:type="spellStart"/>
-      <w:r>
-        <w:t>ClamAV</w:t>
-      </w:r>
-      <w:proofErr w:type="spellEnd"/>
-    </w:p>
-    <w:p>
-      <w:pPr>
-        <w:numPr>
-          <w:ilvl w:val="0"/>
-          <w:numId w:val="9"/>
-        </w:numPr>
-      </w:pPr>
-      <w:r>
-        <w:t>Könnyű adminisztráció</w:t>
-      </w:r>
-    </w:p>
-    <w:p>
-      <w:pPr>
-        <w:numPr>
-          <w:ilvl w:val="0"/>
-          <w:numId w:val="9"/>
-        </w:numPr>
-      </w:pPr>
-      <w:r>
-        <w:lastRenderedPageBreak/>
-        <w:t>Automatikus konténerkezelés</w:t>
-      </w:r>
-    </w:p>
-    <w:p/>
     <w:p/>
     <w:sectPr>
       <w:pgSz w:w="11906" w:h="16838"/>

</xml_diff>